<commit_message>
Add Claude development skills to site and downloadable CV
Site:
- New "Claude Development" block in the AI section (2x2 cards):
  Claude / AI-Assisted Development, Claude Code Engineering,
  MCP & Agentic Orchestration, Retrieval, Data & Automation
- Fix card grid spacing: main.js adds .section to every .card, so cards
  inherited a 6rem bottom margin; neutralised so rows use `gap`
- Add grid-pair modifier for balanced 4-card layouts
- Add missing favicon files (fixes 404s on 16/32px + apple-touch-icon)

Resume (source + downloads):
- Expand "AI & Automation Experience" into "Claude Development,
  Agentic AI & Automation" with structured skill lines
- Regenerate downloadable PDF + DOCX

Co-Authored-By: Claude Opus 4.8 <noreply@anthropic.com>
</commit_message>
<xml_diff>
--- a/Julian_Shaw_Resume_DotNet_Azure.docx
+++ b/Julian_Shaw_Resume_DotNet_Azure.docx
@@ -268,7 +268,7 @@
           <w:sz w:val="22"/>
           <w:szCs w:val="22"/>
         </w:rPr>
-        <w:t xml:space="preserve">AI &amp; AUTOMATION EXPERIENCE</w:t>
+        <w:t xml:space="preserve">CLAUDE DEVELOPMENT, AGENTIC AI &amp; AUTOMATION</w:t>
       </w:r>
     </w:p>
     <w:p>
@@ -282,6 +282,150 @@
           <w:szCs w:val="20"/>
         </w:rPr>
         <w:t xml:space="preserve">Early adopter and power user of Claude and Cursor IDE for AI-assisted software development — architectural reasoning, automated refactoring, agentic workflow orchestration and test generation. Built two MCP (Model Context Protocol) servers exposing 55 AI tools for risk assessment, churn prediction and natural-language queries on the Auditraks platform. Additional exposure to RAG pipelines, vector databases and workflow automation (n8n).</w:t>
+      </w:r>
+    </w:p>
+    <w:p>
+      <w:pPr>
+        <w:spacing w:after="40"/>
+      </w:pPr>
+      <w:r>
+        <w:rPr>
+          <w:rFonts w:ascii="Calibri" w:cs="Calibri" w:eastAsia="Calibri" w:hAnsi="Calibri"/>
+          <w:b/>
+          <w:bCs/>
+          <w:color w:val="1F3864"/>
+          <w:sz w:val="20"/>
+          <w:szCs w:val="20"/>
+        </w:rPr>
+        <w:t xml:space="preserve">Claude / AI-Assisted Development:  </w:t>
+      </w:r>
+      <w:r>
+        <w:rPr>
+          <w:rFonts w:ascii="Calibri" w:cs="Calibri" w:eastAsia="Calibri" w:hAnsi="Calibri"/>
+          <w:sz w:val="20"/>
+          <w:szCs w:val="20"/>
+        </w:rPr>
+        <w:t xml:space="preserve">Claude (Anthropic) &amp; Claude Code  •  Cursor IDE  •  Prompt engineering  •  AI pair-programming  •  Automated refactoring &amp; test generation</w:t>
+      </w:r>
+    </w:p>
+    <w:p>
+      <w:pPr>
+        <w:spacing w:after="40"/>
+      </w:pPr>
+      <w:r>
+        <w:rPr>
+          <w:rFonts w:ascii="Calibri" w:cs="Calibri" w:eastAsia="Calibri" w:hAnsi="Calibri"/>
+          <w:b/>
+          <w:bCs/>
+          <w:color w:val="1F3864"/>
+          <w:sz w:val="20"/>
+          <w:szCs w:val="20"/>
+        </w:rPr>
+        <w:t xml:space="preserve">Claude Code Engineering:  </w:t>
+      </w:r>
+      <w:r>
+        <w:rPr>
+          <w:rFonts w:ascii="Calibri" w:cs="Calibri" w:eastAsia="Calibri" w:hAnsi="Calibri"/>
+          <w:sz w:val="20"/>
+          <w:szCs w:val="20"/>
+        </w:rPr>
+        <w:t xml:space="preserve">CLAUDE.md architectural briefs &amp; working agreements  •  Custom slash commands &amp; agent skills  •  Subagents with git-worktree isolation  •  Plan mode &amp; permission gating  •  Context engineering</w:t>
+      </w:r>
+    </w:p>
+    <w:p>
+      <w:pPr>
+        <w:spacing w:after="40"/>
+      </w:pPr>
+      <w:r>
+        <w:rPr>
+          <w:rFonts w:ascii="Calibri" w:cs="Calibri" w:eastAsia="Calibri" w:hAnsi="Calibri"/>
+          <w:b/>
+          <w:bCs/>
+          <w:color w:val="1F3864"/>
+          <w:sz w:val="20"/>
+          <w:szCs w:val="20"/>
+        </w:rPr>
+        <w:t xml:space="preserve">MCP &amp; Agentic Orchestration:  </w:t>
+      </w:r>
+      <w:r>
+        <w:rPr>
+          <w:rFonts w:ascii="Calibri" w:cs="Calibri" w:eastAsia="Calibri" w:hAnsi="Calibri"/>
+          <w:sz w:val="20"/>
+          <w:szCs w:val="20"/>
+        </w:rPr>
+        <w:t xml:space="preserve">Model Context Protocol (MCP) server development  •  CrewAI  •  LangGraph  •  AutoGen  •  OpenAI Agents SDK  •  LangChain</w:t>
+      </w:r>
+    </w:p>
+    <w:p>
+      <w:pPr>
+        <w:spacing w:after="40"/>
+      </w:pPr>
+      <w:r>
+        <w:rPr>
+          <w:rFonts w:ascii="Calibri" w:cs="Calibri" w:eastAsia="Calibri" w:hAnsi="Calibri"/>
+          <w:b/>
+          <w:bCs/>
+          <w:color w:val="1F3864"/>
+          <w:sz w:val="20"/>
+          <w:szCs w:val="20"/>
+        </w:rPr>
+        <w:t xml:space="preserve">Retrieval &amp; Data:  </w:t>
+      </w:r>
+      <w:r>
+        <w:rPr>
+          <w:rFonts w:ascii="Calibri" w:cs="Calibri" w:eastAsia="Calibri" w:hAnsi="Calibri"/>
+          <w:sz w:val="20"/>
+          <w:szCs w:val="20"/>
+        </w:rPr>
+        <w:t xml:space="preserve">RAG pipelines  •  Vector databases (Pinecone, Chroma)  •  Natural-language query interfaces</w:t>
+      </w:r>
+    </w:p>
+    <w:p>
+      <w:pPr>
+        <w:spacing w:after="40"/>
+      </w:pPr>
+      <w:r>
+        <w:rPr>
+          <w:rFonts w:ascii="Calibri" w:cs="Calibri" w:eastAsia="Calibri" w:hAnsi="Calibri"/>
+          <w:b/>
+          <w:bCs/>
+          <w:color w:val="1F3864"/>
+          <w:sz w:val="20"/>
+          <w:szCs w:val="20"/>
+        </w:rPr>
+        <w:t xml:space="preserve">Workflow Automation:  </w:t>
+      </w:r>
+      <w:r>
+        <w:rPr>
+          <w:rFonts w:ascii="Calibri" w:cs="Calibri" w:eastAsia="Calibri" w:hAnsi="Calibri"/>
+          <w:sz w:val="20"/>
+          <w:szCs w:val="20"/>
+        </w:rPr>
+        <w:t xml:space="preserve">n8n workflow automation  •  Home Assistant automation  •  Python trading-bot automation (MT4 / cTrader)  •  Voice-to-text automation</w:t>
+      </w:r>
+    </w:p>
+    <w:p>
+      <w:pPr>
+        <w:spacing w:after="40"/>
+      </w:pPr>
+      <w:r>
+        <w:rPr>
+          <w:rFonts w:ascii="Calibri" w:cs="Calibri" w:eastAsia="Calibri" w:hAnsi="Calibri"/>
+          <w:b/>
+          <w:bCs/>
+          <w:color w:val="1F3864"/>
+          <w:sz w:val="20"/>
+          <w:szCs w:val="20"/>
+        </w:rPr>
+        <w:t xml:space="preserve">Applied AI Projects:  </w:t>
+      </w:r>
+      <w:r>
+        <w:rPr>
+          <w:rFonts w:ascii="Calibri" w:cs="Calibri" w:eastAsia="Calibri" w:hAnsi="Calibri"/>
+          <w:sz w:val="20"/>
+          <w:szCs w:val="20"/>
+        </w:rPr>
+        <w:t xml:space="preserve">Auditraks MCP servers (55 AI tools) for custody tracking, risk assessment &amp; churn prediction  •  AI-generated CV summaries &amp; action plans  •  AI-driven legal document review (Legal-JM)</w:t>
       </w:r>
     </w:p>
     <w:p>

</xml_diff>